<commit_message>
chore: commit cleaned template (Recuerda paragraph removed from file)
Co-Authored-By: Claude Sonnet 4.6 <noreply@anthropic.com>
</commit_message>
<xml_diff>
--- a/Plantilla_Certificacion.docx
+++ b/Plantilla_Certificacion.docx
@@ -523,240 +523,6 @@
             </a:graphic>
           </wp:anchor>
         </w:drawing>
-      </w:r>
-    </w:p>
-    <w:p>
-      <w:pPr>
-        <w:spacing w:before="134"/>
-        <w:ind w:left="170"/>
-        <w:rPr>
-          <w:rFonts w:ascii="Cambria"/>
-          <w:b/>
-          <w:i/>
-        </w:rPr>
-        <w:sectPr>
-          <w:headerReference w:type="even" r:id="rId8"/>
-          <w:headerReference w:type="default" r:id="rId9"/>
-          <w:footerReference w:type="even" r:id="rId10"/>
-          <w:footerReference w:type="default" r:id="rId11"/>
-          <w:headerReference w:type="first" r:id="rId12"/>
-          <w:footerReference w:type="first" r:id="rId13"/>
-          <w:type w:val="continuous"/>
-          <w:pgSz w:w="11910" w:h="16840"/>
-          <w:pgMar w:top="900" w:right="708" w:bottom="920" w:left="566" w:header="0" w:footer="729" w:gutter="0"/>
-          <w:pgNumType w:start="1"/>
-          <w:cols w:space="720"/>
-        </w:sectPr>
-      </w:pPr>
-      <w:r>
-        <w:rPr>
-          <w:rFonts w:ascii="Cambria"/>
-          <w:b/>
-          <w:i/>
-          <w:color w:val="3333CC"/>
-        </w:rPr>
-        <w:t>**</w:t>
-      </w:r>
-      <w:r>
-        <w:rPr>
-          <w:rFonts w:ascii="Cambria"/>
-          <w:b/>
-          <w:i/>
-          <w:color w:val="3333CC"/>
-          <w:spacing w:val="-6"/>
-        </w:rPr>
-        <w:t xml:space="preserve"> </w:t>
-      </w:r>
-      <w:r>
-        <w:rPr>
-          <w:rFonts w:ascii="Arial"/>
-          <w:b/>
-          <w:i/>
-          <w:color w:val="3333CC"/>
-          <w:sz w:val="24"/>
-        </w:rPr>
-        <w:t>Recuerda</w:t>
-      </w:r>
-      <w:r>
-        <w:rPr>
-          <w:rFonts w:ascii="Arial"/>
-          <w:b/>
-          <w:i/>
-          <w:color w:val="3333CC"/>
-          <w:spacing w:val="-1"/>
-          <w:sz w:val="24"/>
-        </w:rPr>
-        <w:t xml:space="preserve"> </w:t>
-      </w:r>
-      <w:r>
-        <w:rPr>
-          <w:rFonts w:ascii="Arial"/>
-          <w:b/>
-          <w:i/>
-          <w:color w:val="3333CC"/>
-          <w:sz w:val="24"/>
-        </w:rPr>
-        <w:t>que</w:t>
-      </w:r>
-      <w:r>
-        <w:rPr>
-          <w:rFonts w:ascii="Arial"/>
-          <w:b/>
-          <w:i/>
-          <w:color w:val="3333CC"/>
-          <w:spacing w:val="-4"/>
-          <w:sz w:val="24"/>
-        </w:rPr>
-        <w:t xml:space="preserve"> </w:t>
-      </w:r>
-      <w:r>
-        <w:rPr>
-          <w:rFonts w:ascii="Arial"/>
-          <w:b/>
-          <w:i/>
-          <w:color w:val="3333CC"/>
-          <w:sz w:val="24"/>
-        </w:rPr>
-        <w:t>ahora</w:t>
-      </w:r>
-      <w:r>
-        <w:rPr>
-          <w:rFonts w:ascii="Arial"/>
-          <w:b/>
-          <w:i/>
-          <w:color w:val="3333CC"/>
-          <w:spacing w:val="1"/>
-          <w:sz w:val="24"/>
-        </w:rPr>
-        <w:t xml:space="preserve"> </w:t>
-      </w:r>
-      <w:r>
-        <w:rPr>
-          <w:rFonts w:ascii="Arial"/>
-          <w:b/>
-          <w:i/>
-          <w:color w:val="3333CC"/>
-          <w:sz w:val="24"/>
-        </w:rPr>
-        <w:t>puedes</w:t>
-      </w:r>
-      <w:r>
-        <w:rPr>
-          <w:rFonts w:ascii="Arial"/>
-          <w:b/>
-          <w:i/>
-          <w:color w:val="3333CC"/>
-          <w:spacing w:val="-3"/>
-          <w:sz w:val="24"/>
-        </w:rPr>
-        <w:t xml:space="preserve"> </w:t>
-      </w:r>
-      <w:r>
-        <w:rPr>
-          <w:rFonts w:ascii="Arial"/>
-          <w:b/>
-          <w:i/>
-          <w:color w:val="3333CC"/>
-          <w:sz w:val="24"/>
-        </w:rPr>
-        <w:t>evaluar</w:t>
-      </w:r>
-      <w:r>
-        <w:rPr>
-          <w:rFonts w:ascii="Arial"/>
-          <w:b/>
-          <w:i/>
-          <w:color w:val="3333CC"/>
-          <w:spacing w:val="-1"/>
-          <w:sz w:val="24"/>
-        </w:rPr>
-        <w:t xml:space="preserve"> </w:t>
-      </w:r>
-      <w:r>
-        <w:rPr>
-          <w:rFonts w:ascii="Arial"/>
-          <w:b/>
-          <w:i/>
-          <w:color w:val="3333CC"/>
-          <w:sz w:val="24"/>
-        </w:rPr>
-        <w:t>nuestro</w:t>
-      </w:r>
-      <w:r>
-        <w:rPr>
-          <w:rFonts w:ascii="Arial"/>
-          <w:b/>
-          <w:i/>
-          <w:color w:val="3333CC"/>
-          <w:spacing w:val="-1"/>
-          <w:sz w:val="24"/>
-        </w:rPr>
-        <w:t xml:space="preserve"> </w:t>
-      </w:r>
-      <w:r>
-        <w:rPr>
-          <w:rFonts w:ascii="Arial"/>
-          <w:b/>
-          <w:i/>
-          <w:color w:val="3333CC"/>
-          <w:sz w:val="24"/>
-        </w:rPr>
-        <w:t>servicio</w:t>
-      </w:r>
-      <w:r>
-        <w:rPr>
-          <w:rFonts w:ascii="Arial"/>
-          <w:b/>
-          <w:i/>
-          <w:color w:val="3333CC"/>
-          <w:spacing w:val="-3"/>
-          <w:sz w:val="24"/>
-        </w:rPr>
-        <w:t xml:space="preserve"> </w:t>
-      </w:r>
-      <w:r>
-        <w:rPr>
-          <w:rFonts w:ascii="Arial"/>
-          <w:b/>
-          <w:i/>
-          <w:color w:val="3333CC"/>
-          <w:sz w:val="24"/>
-        </w:rPr>
-        <w:t xml:space="preserve">como Facultad </w:t>
-      </w:r>
-      <w:proofErr w:type="spellStart"/>
-      <w:r>
-        <w:rPr>
-          <w:rFonts w:ascii="Arial"/>
-          <w:b/>
-          <w:i/>
-          <w:color w:val="0000FF"/>
-          <w:sz w:val="24"/>
-          <w:u w:val="single" w:color="0000FF"/>
-        </w:rPr>
-        <w:t>aqui</w:t>
-      </w:r>
-      <w:proofErr w:type="spellEnd"/>
-      <w:r>
-        <w:rPr>
-          <w:rFonts w:ascii="Arial"/>
-          <w:b/>
-          <w:i/>
-          <w:color w:val="0000FF"/>
-          <w:spacing w:val="-20"/>
-          <w:sz w:val="24"/>
-        </w:rPr>
-        <w:t xml:space="preserve"> </w:t>
-      </w:r>
-      <w:r>
-        <w:rPr>
-          <w:rFonts w:ascii="Cambria"/>
-          <w:b/>
-          <w:i/>
-          <w:color w:val="3333CC"/>
-          <w:spacing w:val="-5"/>
-        </w:rPr>
-        <w:t>**</w:t>
       </w:r>
     </w:p>
     <w:p>

</xml_diff>